<commit_message>
Fit Iris D1 receipts on one page
</commit_message>
<xml_diff>
--- a/public/acorns=iris/D.1 The manufactured triplet, and what deduplication deletes.docx
+++ b/public/acorns=iris/D.1 The manufactured triplet, and what deduplication deletes.docx
@@ -1095,18 +1095,14 @@
         <w:rPr>
           <w:rFonts w:eastAsia="Arial" w:cs="Arial" w:ascii="Arial" w:hAnsi="Arial"/>
         </w:rPr>
-        <w:br/>
-        <w:br/>
       </w:r>
       <w:r>
         <w:rPr/>
-        <w:br/>
       </w:r>
       <w:r>
         <w:rPr>
           <w:rFonts w:eastAsia="Arial" w:cs="Arial" w:ascii="Arial" w:hAnsi="Arial"/>
         </w:rPr>
-        <w:br/>
       </w:r>
       <w:r>
         <w:rPr/>

</xml_diff>